<commit_message>
Add script to generate user manuals for YESA profiles
- Implemented a Python script that creates Word documents for user manuals based on different user profiles.
- The script includes functions to add titles, paragraphs, bullet points, and tables to the document.
- Mapped page titles to their corresponding URLs for easy reference in the manuals.
- Generated manuals for four user profiles: Cliente, Auxiliar, Administrador, and Usuario sin registrar.
- Saved the generated documents in the specified output directory.
</commit_message>
<xml_diff>
--- a/Docs/documentacion final/Manuales de usuario/Manual_Usuario_YESA_Auxiliar.docx
+++ b/Docs/documentacion final/Manuales de usuario/Manual_Usuario_YESA_Auxiliar.docx
@@ -597,6 +597,11 @@
       </w:r>
     </w:p>
     <w:p>
+      <w:r>
+        <w:t>URL de la pantalla: /login</w:t>
+      </w:r>
+    </w:p>
+    <w:p>
       <w:pPr>
         <w:pStyle w:val="ListBullet"/>
       </w:pPr>
@@ -666,6 +671,11 @@
       </w:r>
     </w:p>
     <w:p>
+      <w:r>
+        <w:t>URL de la pantalla: /login</w:t>
+      </w:r>
+    </w:p>
+    <w:p>
       <w:pPr>
         <w:pStyle w:val="ListBullet"/>
       </w:pPr>
@@ -743,6 +753,11 @@
       </w:r>
     </w:p>
     <w:p>
+      <w:r>
+        <w:t>URL de la pantalla: /register</w:t>
+      </w:r>
+    </w:p>
+    <w:p>
       <w:pPr>
         <w:pStyle w:val="ListBullet"/>
       </w:pPr>
@@ -852,6 +867,11 @@
       </w:r>
     </w:p>
     <w:p>
+      <w:r>
+        <w:t>URL de la pantalla: /</w:t>
+      </w:r>
+    </w:p>
+    <w:p>
       <w:pPr>
         <w:pStyle w:val="ListBullet"/>
       </w:pPr>
@@ -920,7 +940,7 @@
         <w:pStyle w:val="ListBullet"/>
       </w:pPr>
       <w:r>
-        <w:t>Los auxiliares ven el menú 'Administración' con accesos a Dashboard, Pedidos, Categorías, Subcategorías, Productos y Soporte, pero con alcance limitado.</w:t>
+        <w:t>Los auxiliares ven el menú 'Administración' con accesos a Dashboard, Pedidos, Categorías, Subcategorías, Productos y Soporte, pero con permisos limitados.</w:t>
       </w:r>
     </w:p>
     <w:p>
@@ -961,6 +981,11 @@
       </w:r>
     </w:p>
     <w:p>
+      <w:r>
+        <w:t>URL de la pantalla: /</w:t>
+      </w:r>
+    </w:p>
+    <w:p>
       <w:pPr>
         <w:pStyle w:val="ListBullet"/>
       </w:pPr>
@@ -1038,6 +1063,11 @@
       </w:r>
     </w:p>
     <w:p>
+      <w:r>
+        <w:t>URL de la pantalla: /producto/:id</w:t>
+      </w:r>
+    </w:p>
+    <w:p>
       <w:pPr>
         <w:pStyle w:val="ListBullet"/>
       </w:pPr>
@@ -1107,6 +1137,11 @@
       </w:r>
     </w:p>
     <w:p>
+      <w:r>
+        <w:t>URL de la pantalla: /carrito</w:t>
+      </w:r>
+    </w:p>
+    <w:p>
       <w:pPr>
         <w:pStyle w:val="ListBullet"/>
       </w:pPr>
@@ -1192,6 +1227,11 @@
       </w:r>
     </w:p>
     <w:p>
+      <w:r>
+        <w:t>URL de la pantalla: /checkout</w:t>
+      </w:r>
+    </w:p>
+    <w:p>
       <w:pPr>
         <w:pStyle w:val="ListBullet"/>
       </w:pPr>
@@ -1269,6 +1309,11 @@
       </w:r>
     </w:p>
     <w:p>
+      <w:r>
+        <w:t>URL de la pantalla: /personalizar</w:t>
+      </w:r>
+    </w:p>
+    <w:p>
       <w:pPr>
         <w:pStyle w:val="ListBullet"/>
       </w:pPr>
@@ -1426,6 +1471,11 @@
       </w:r>
     </w:p>
     <w:p>
+      <w:r>
+        <w:t>URL de la pantalla: /favoritos</w:t>
+      </w:r>
+    </w:p>
+    <w:p>
       <w:pPr>
         <w:pStyle w:val="ListBullet"/>
       </w:pPr>
@@ -1463,6 +1513,11 @@
       </w:r>
     </w:p>
     <w:p>
+      <w:r>
+        <w:t>URL de la pantalla: /mis-pedidos</w:t>
+      </w:r>
+    </w:p>
+    <w:p>
       <w:pPr>
         <w:pStyle w:val="ListBullet"/>
       </w:pPr>
@@ -1500,6 +1555,11 @@
       </w:r>
     </w:p>
     <w:p>
+      <w:r>
+        <w:t>URL de la pantalla: /mis-cotizaciones</w:t>
+      </w:r>
+    </w:p>
+    <w:p>
       <w:pPr>
         <w:pStyle w:val="ListBullet"/>
       </w:pPr>
@@ -1553,6 +1613,11 @@
       </w:r>
     </w:p>
     <w:p>
+      <w:r>
+        <w:t>URL de la pantalla: /mis-consultas</w:t>
+      </w:r>
+    </w:p>
+    <w:p>
       <w:pPr>
         <w:pStyle w:val="ListBullet"/>
       </w:pPr>
@@ -1606,6 +1671,11 @@
       </w:r>
     </w:p>
     <w:p>
+      <w:r>
+        <w:t>URL de la pantalla: /disenos-guardados</w:t>
+      </w:r>
+    </w:p>
+    <w:p>
       <w:pPr>
         <w:pStyle w:val="ListBullet"/>
       </w:pPr>
@@ -1683,6 +1753,11 @@
       </w:r>
     </w:p>
     <w:p>
+      <w:r>
+        <w:t>URL de la pantalla: /perfil</w:t>
+      </w:r>
+    </w:p>
+    <w:p>
       <w:pPr>
         <w:pStyle w:val="ListBullet"/>
       </w:pPr>
@@ -1760,6 +1835,11 @@
       </w:r>
     </w:p>
     <w:p>
+      <w:r>
+        <w:t>URL de la pantalla: /admin/dashboard</w:t>
+      </w:r>
+    </w:p>
+    <w:p>
       <w:pPr>
         <w:pStyle w:val="ListBullet"/>
       </w:pPr>
@@ -1805,6 +1885,11 @@
       </w:r>
     </w:p>
     <w:p>
+      <w:r>
+        <w:t>URL de la pantalla: /admin/pedidos</w:t>
+      </w:r>
+    </w:p>
+    <w:p>
       <w:pPr>
         <w:pStyle w:val="ListBullet"/>
       </w:pPr>
@@ -1866,6 +1951,11 @@
       </w:r>
     </w:p>
     <w:p>
+      <w:r>
+        <w:t>URL de la pantalla: /admin/categorias</w:t>
+      </w:r>
+    </w:p>
+    <w:p>
       <w:pPr>
         <w:pStyle w:val="ListBullet"/>
       </w:pPr>
@@ -1972,6 +2062,11 @@
       </w:r>
     </w:p>
     <w:p>
+      <w:r>
+        <w:t>URL de la pantalla: /admin/productos</w:t>
+      </w:r>
+    </w:p>
+    <w:p>
       <w:pPr>
         <w:pStyle w:val="ListBullet"/>
       </w:pPr>
@@ -2030,6 +2125,11 @@
     <w:p>
       <w:r>
         <w:t>La sección de soporte permite revisar mensajes recibidos y responderlos desde la plataforma, dentro del alcance del rol de apoyo.</w:t>
+      </w:r>
+    </w:p>
+    <w:p>
+      <w:r>
+        <w:t>URL de la pantalla: /admin/contactos</w:t>
       </w:r>
     </w:p>
     <w:p>

</xml_diff>